<commit_message>
se realizó la introducción del documento
</commit_message>
<xml_diff>
--- a/Actividad del SENA núm-2.docx
+++ b/Actividad del SENA núm-2.docx
@@ -53,29 +53,7 @@
           <w:sz w:val="52"/>
           <w:szCs w:val="52"/>
         </w:rPr>
-        <w:t xml:space="preserve">Aprendiz: </w:t>
-      </w:r>
-      <w:proofErr w:type="spellStart"/>
-      <w:r>
-        <w:rPr>
-          <w:b/>
-          <w:bCs/>
-          <w:color w:val="000000" w:themeColor="text1"/>
-          <w:sz w:val="52"/>
-          <w:szCs w:val="52"/>
-        </w:rPr>
-        <w:t>Yedinson</w:t>
-      </w:r>
-      <w:proofErr w:type="spellEnd"/>
-      <w:r>
-        <w:rPr>
-          <w:b/>
-          <w:bCs/>
-          <w:color w:val="000000" w:themeColor="text1"/>
-          <w:sz w:val="52"/>
-          <w:szCs w:val="52"/>
-        </w:rPr>
-        <w:t xml:space="preserve"> Ortiz </w:t>
+        <w:t xml:space="preserve">Aprendiz: Yedinson Ortiz </w:t>
       </w:r>
       <w:proofErr w:type="spellStart"/>
       <w:r>
@@ -242,6 +220,7 @@
           <w:szCs w:val="52"/>
         </w:rPr>
       </w:pPr>
+      <w:proofErr w:type="gramStart"/>
       <w:r>
         <w:rPr>
           <w:b/>
@@ -258,7 +237,16 @@
           <w:sz w:val="52"/>
           <w:szCs w:val="52"/>
         </w:rPr>
-        <w:t xml:space="preserve"> se encarga de ayudar en la inversión y desarrollo tanto técnico como social a </w:t>
+        <w:t xml:space="preserve"> se</w:t>
+      </w:r>
+      <w:proofErr w:type="gramEnd"/>
+      <w:r>
+        <w:rPr>
+          <w:color w:val="000000" w:themeColor="text1"/>
+          <w:sz w:val="52"/>
+          <w:szCs w:val="52"/>
+        </w:rPr>
+        <w:t xml:space="preserve"> encarga de ayudar en la inversión y desarrollo tanto técnico como social a </w:t>
       </w:r>
       <w:r>
         <w:rPr>
@@ -715,7 +703,16 @@
                 <w:sz w:val="52"/>
                 <w:szCs w:val="52"/>
               </w:rPr>
-              <w:t xml:space="preserve"> su debido </w:t>
+              <w:t xml:space="preserve"> su </w:t>
+            </w:r>
+            <w:proofErr w:type="gramStart"/>
+            <w:r>
+              <w:rPr>
+                <w:color w:val="000000" w:themeColor="text1"/>
+                <w:sz w:val="52"/>
+                <w:szCs w:val="52"/>
+              </w:rPr>
+              <w:t xml:space="preserve">debido </w:t>
             </w:r>
             <w:r>
               <w:rPr>
@@ -731,7 +728,16 @@
                 <w:sz w:val="52"/>
                 <w:szCs w:val="52"/>
               </w:rPr>
-              <w:t xml:space="preserve">respeto y dándole así una libertad </w:t>
+              <w:t>respeto</w:t>
+            </w:r>
+            <w:proofErr w:type="gramEnd"/>
+            <w:r>
+              <w:rPr>
+                <w:color w:val="000000" w:themeColor="text1"/>
+                <w:sz w:val="52"/>
+                <w:szCs w:val="52"/>
+              </w:rPr>
+              <w:t xml:space="preserve"> y dándole así una libertad </w:t>
             </w:r>
             <w:r>
               <w:rPr>
@@ -904,7 +910,25 @@
                 <w:sz w:val="52"/>
                 <w:szCs w:val="52"/>
               </w:rPr>
-              <w:t xml:space="preserve">con sus usuarios internos e externos </w:t>
+              <w:t xml:space="preserve">con sus usuarios internos </w:t>
+            </w:r>
+            <w:proofErr w:type="gramStart"/>
+            <w:r>
+              <w:rPr>
+                <w:color w:val="000000" w:themeColor="text1"/>
+                <w:sz w:val="52"/>
+                <w:szCs w:val="52"/>
+              </w:rPr>
+              <w:t>e</w:t>
+            </w:r>
+            <w:proofErr w:type="gramEnd"/>
+            <w:r>
+              <w:rPr>
+                <w:color w:val="000000" w:themeColor="text1"/>
+                <w:sz w:val="52"/>
+                <w:szCs w:val="52"/>
+              </w:rPr>
+              <w:t xml:space="preserve"> externos </w:t>
             </w:r>
             <w:r>
               <w:rPr>
@@ -1006,8 +1030,18 @@
           <w:sz w:val="52"/>
           <w:szCs w:val="52"/>
         </w:rPr>
-        <w:t>Nota: el anterior información</w:t>
-      </w:r>
+        <w:t xml:space="preserve">Nota: </w:t>
+      </w:r>
+      <w:proofErr w:type="gramStart"/>
+      <w:r>
+        <w:rPr>
+          <w:color w:val="000000" w:themeColor="text1"/>
+          <w:sz w:val="52"/>
+          <w:szCs w:val="52"/>
+        </w:rPr>
+        <w:t>el anterior información</w:t>
+      </w:r>
+      <w:proofErr w:type="gramEnd"/>
     </w:p>
     <w:p>
       <w:pPr>
@@ -1489,71 +1523,6 @@
           <w:szCs w:val="52"/>
         </w:rPr>
       </w:pPr>
-      <w:r>
-        <w:rPr>
-          <w:b/>
-          <w:bCs/>
-          <w:noProof/>
-          <w:color w:val="000000" w:themeColor="text1"/>
-          <w:sz w:val="52"/>
-          <w:szCs w:val="52"/>
-        </w:rPr>
-        <w:drawing>
-          <wp:anchor distT="0" distB="0" distL="114300" distR="114300" simplePos="0" relativeHeight="251661312" behindDoc="0" locked="0" layoutInCell="1" allowOverlap="1" wp14:anchorId="30DCC52D" wp14:editId="2F8151CD">
-            <wp:simplePos x="0" y="0"/>
-            <wp:positionH relativeFrom="column">
-              <wp:posOffset>-825500</wp:posOffset>
-            </wp:positionH>
-            <wp:positionV relativeFrom="paragraph">
-              <wp:posOffset>534035</wp:posOffset>
-            </wp:positionV>
-            <wp:extent cx="6858000" cy="5220335"/>
-            <wp:effectExtent l="0" t="0" r="0" b="0"/>
-            <wp:wrapTopAndBottom/>
-            <wp:docPr id="1" name="Imagen 1"/>
-            <wp:cNvGraphicFramePr>
-              <a:graphicFrameLocks xmlns:a="http://schemas.openxmlformats.org/drawingml/2006/main" noChangeAspect="1"/>
-            </wp:cNvGraphicFramePr>
-            <a:graphic xmlns:a="http://schemas.openxmlformats.org/drawingml/2006/main">
-              <a:graphicData uri="http://schemas.openxmlformats.org/drawingml/2006/picture">
-                <pic:pic xmlns:pic="http://schemas.openxmlformats.org/drawingml/2006/picture">
-                  <pic:nvPicPr>
-                    <pic:cNvPr id="1" name="Imagen 1"/>
-                    <pic:cNvPicPr/>
-                  </pic:nvPicPr>
-                  <pic:blipFill>
-                    <a:blip r:embed="rId7" cstate="print">
-                      <a:extLst>
-                        <a:ext uri="{28A0092B-C50C-407E-A947-70E740481C1C}">
-                          <a14:useLocalDpi xmlns:a14="http://schemas.microsoft.com/office/drawing/2010/main" val="0"/>
-                        </a:ext>
-                      </a:extLst>
-                    </a:blip>
-                    <a:stretch>
-                      <a:fillRect/>
-                    </a:stretch>
-                  </pic:blipFill>
-                  <pic:spPr>
-                    <a:xfrm>
-                      <a:off x="0" y="0"/>
-                      <a:ext cx="6858000" cy="5220335"/>
-                    </a:xfrm>
-                    <a:prstGeom prst="rect">
-                      <a:avLst/>
-                    </a:prstGeom>
-                  </pic:spPr>
-                </pic:pic>
-              </a:graphicData>
-            </a:graphic>
-            <wp14:sizeRelH relativeFrom="margin">
-              <wp14:pctWidth>0</wp14:pctWidth>
-            </wp14:sizeRelH>
-            <wp14:sizeRelV relativeFrom="margin">
-              <wp14:pctHeight>0</wp14:pctHeight>
-            </wp14:sizeRelV>
-          </wp:anchor>
-        </w:drawing>
-      </w:r>
     </w:p>
     <w:sectPr>
       <w:pgSz w:w="11906" w:h="16838"/>

</xml_diff>